<commit_message>
Update project author to Abdullah Irshad and remove student ID
</commit_message>
<xml_diff>
--- a/Fruit Ripeness Prototype/Fall 2024_CS619_10053_2 (2).docx
+++ b/Fruit Ripeness Prototype/Fall 2024_CS619_10053_2 (2).docx
@@ -167,7 +167,7 @@
           <w:sz w:val="28"/>
           <w:szCs w:val="28"/>
         </w:rPr>
-        <w:t>F24PROJECT905CD</w:t>
+        <w:t>AbdullahIrshadShah</w:t>
       </w:r>
     </w:p>
     <w:p>
@@ -604,7 +604,7 @@
                 <w:sz w:val="28"/>
                 <w:szCs w:val="28"/>
               </w:rPr>
-              <w:t>BC210423321</w:t>
+              <w:t>Abdullah Irshad</w:t>
             </w:r>
           </w:p>
         </w:tc>
@@ -3767,7 +3767,7 @@
                 <w:sz w:val="28"/>
                 <w:szCs w:val="28"/>
               </w:rPr>
-              <w:t>BC210423321</w:t>
+              <w:t>Abdullah Irshad</w:t>
             </w:r>
           </w:p>
         </w:tc>
@@ -4036,7 +4036,7 @@
                 <w:sz w:val="28"/>
                 <w:szCs w:val="28"/>
               </w:rPr>
-              <w:t>BC210423321</w:t>
+              <w:t>Abdullah Irshad</w:t>
             </w:r>
           </w:p>
         </w:tc>
@@ -4305,7 +4305,7 @@
                 <w:sz w:val="28"/>
                 <w:szCs w:val="28"/>
               </w:rPr>
-              <w:t>BC210423321</w:t>
+              <w:t>Abdullah Irshad</w:t>
             </w:r>
           </w:p>
         </w:tc>
@@ -4574,7 +4574,7 @@
                 <w:sz w:val="28"/>
                 <w:szCs w:val="28"/>
               </w:rPr>
-              <w:t>BC210423321</w:t>
+              <w:t>Abdullah Irshad</w:t>
             </w:r>
           </w:p>
         </w:tc>
@@ -4843,7 +4843,7 @@
                 <w:sz w:val="28"/>
                 <w:szCs w:val="28"/>
               </w:rPr>
-              <w:t>BC210423321</w:t>
+              <w:t>Abdullah Irshad</w:t>
             </w:r>
           </w:p>
         </w:tc>
@@ -5112,7 +5112,7 @@
                 <w:sz w:val="28"/>
                 <w:szCs w:val="28"/>
               </w:rPr>
-              <w:t>BC210423321</w:t>
+              <w:t>Abdullah Irshad</w:t>
             </w:r>
           </w:p>
         </w:tc>
@@ -5381,7 +5381,7 @@
                 <w:sz w:val="28"/>
                 <w:szCs w:val="28"/>
               </w:rPr>
-              <w:t>BC210423321</w:t>
+              <w:t>Abdullah Irshad</w:t>
             </w:r>
           </w:p>
         </w:tc>
@@ -5650,7 +5650,7 @@
                 <w:sz w:val="28"/>
                 <w:szCs w:val="28"/>
               </w:rPr>
-              <w:t>BC210423321</w:t>
+              <w:t>Abdullah Irshad</w:t>
             </w:r>
           </w:p>
         </w:tc>
@@ -5919,7 +5919,7 @@
                 <w:sz w:val="28"/>
                 <w:szCs w:val="28"/>
               </w:rPr>
-              <w:t>BC210423321</w:t>
+              <w:t>Abdullah Irshad</w:t>
             </w:r>
           </w:p>
         </w:tc>
@@ -6188,7 +6188,7 @@
                 <w:sz w:val="28"/>
                 <w:szCs w:val="28"/>
               </w:rPr>
-              <w:t>BC210423321</w:t>
+              <w:t>Abdullah Irshad</w:t>
             </w:r>
           </w:p>
         </w:tc>
@@ -6457,7 +6457,7 @@
                 <w:sz w:val="28"/>
                 <w:szCs w:val="28"/>
               </w:rPr>
-              <w:t>BC210423321</w:t>
+              <w:t>Abdullah Irshad</w:t>
             </w:r>
           </w:p>
         </w:tc>
@@ -6726,7 +6726,7 @@
                 <w:sz w:val="28"/>
                 <w:szCs w:val="28"/>
               </w:rPr>
-              <w:t>BC210423321</w:t>
+              <w:t>Abdullah Irshad</w:t>
             </w:r>
           </w:p>
         </w:tc>
@@ -6995,7 +6995,7 @@
                 <w:sz w:val="28"/>
                 <w:szCs w:val="28"/>
               </w:rPr>
-              <w:t>BC210423321</w:t>
+              <w:t>Abdullah Irshad</w:t>
             </w:r>
           </w:p>
         </w:tc>
@@ -7264,7 +7264,7 @@
                 <w:sz w:val="28"/>
                 <w:szCs w:val="28"/>
               </w:rPr>
-              <w:t>BC210423321</w:t>
+              <w:t>Abdullah Irshad</w:t>
             </w:r>
           </w:p>
         </w:tc>
@@ -7533,7 +7533,7 @@
                 <w:sz w:val="28"/>
                 <w:szCs w:val="28"/>
               </w:rPr>
-              <w:t>BC210423321</w:t>
+              <w:t>Abdullah Irshad</w:t>
             </w:r>
           </w:p>
         </w:tc>

</xml_diff>